<commit_message>
Use DengXian for future submission documents
</commit_message>
<xml_diff>
--- a/templates/submission_template.docx
+++ b/templates/submission_template.docx
@@ -216,7 +216,7 @@
       <w:spacing w:line="360" w:lineRule="auto" w:before="0" w:after="0"/>
     </w:pPr>
     <w:rPr>
-      <w:rFonts w:ascii="Songti SC" w:hAnsi="Songti SC" w:eastAsia="Songti SC"/>
+      <w:rFonts w:ascii="DengXian" w:hAnsi="DengXian" w:eastAsia="DengXian"/>
       <w:b w:val="0"/>
       <w:color w:val="000000"/>
       <w:sz w:val="24"/>
@@ -231,7 +231,7 @@
       <w:spacing w:after="0" w:before="0" w:line="360" w:lineRule="auto"/>
     </w:pPr>
     <w:rPr>
-      <w:rFonts w:ascii="Songti SC" w:hAnsi="Songti SC" w:eastAsia="Songti SC"/>
+      <w:rFonts w:ascii="DengXian" w:hAnsi="DengXian" w:eastAsia="DengXian"/>
       <w:b w:val="0"/>
       <w:color w:val="000000"/>
       <w:sz w:val="24"/>
@@ -246,7 +246,7 @@
       <w:spacing w:line="360" w:lineRule="auto" w:before="0" w:after="0"/>
     </w:pPr>
     <w:rPr>
-      <w:rFonts w:ascii="Songti SC" w:hAnsi="Songti SC" w:eastAsia="Songti SC"/>
+      <w:rFonts w:ascii="DengXian" w:hAnsi="DengXian" w:eastAsia="DengXian"/>
       <w:b w:val="0"/>
       <w:color w:val="000000"/>
       <w:sz w:val="24"/>
@@ -404,7 +404,7 @@
       <w:outlineLvl w:val="0"/>
     </w:pPr>
     <w:rPr>
-      <w:rFonts w:asciiTheme="majorHAnsi" w:cstheme="majorBidi" w:eastAsiaTheme="majorEastAsia" w:hAnsiTheme="majorHAnsi" w:ascii="Songti SC" w:hAnsi="Songti SC" w:eastAsia="Songti SC"/>
+      <w:rFonts w:asciiTheme="majorHAnsi" w:cstheme="majorBidi" w:eastAsiaTheme="majorEastAsia" w:hAnsiTheme="majorHAnsi" w:ascii="DengXian" w:hAnsi="DengXian" w:eastAsia="DengXian"/>
       <w:b/>
       <w:color w:val="000000"/>
       <w:sz w:val="40"/>
@@ -428,7 +428,7 @@
       <w:outlineLvl w:val="1"/>
     </w:pPr>
     <w:rPr>
-      <w:rFonts w:asciiTheme="majorHAnsi" w:cstheme="majorBidi" w:eastAsiaTheme="majorEastAsia" w:hAnsiTheme="majorHAnsi" w:ascii="Songti SC" w:hAnsi="Songti SC" w:eastAsia="Songti SC"/>
+      <w:rFonts w:asciiTheme="majorHAnsi" w:cstheme="majorBidi" w:eastAsiaTheme="majorEastAsia" w:hAnsiTheme="majorHAnsi" w:ascii="DengXian" w:hAnsi="DengXian" w:eastAsia="DengXian"/>
       <w:b/>
       <w:color w:val="000000"/>
       <w:sz w:val="32"/>

</xml_diff>